<commit_message>
Zavření 260919: daily záznam, úklid next-actions, aktualizace dokumentu FEKT
Co-Authored-By: Claude Sonnet 5 <noreply@anthropic.com>
</commit_message>
<xml_diff>
--- a/resources/Stav-vnitrnich-predpisu-FEKT-VUT-260919.docx
+++ b/resources/Stav-vnitrnich-predpisu-FEKT-VUT-260919.docx
@@ -67,6 +67,9 @@
     <w:p>
       <w:pPr>
         <w:spacing w:after="40"/>
+        <w:rPr>
+          <w:sz w:val="22"/>
+        </w:rPr>
       </w:pPr>
       <w:r>
         <w:rPr>
@@ -102,6 +105,12 @@
         <w:rPr>
           <w:sz w:val="22"/>
         </w:rPr>
+        <w:t>,</w:t>
+      </w:r>
+      <w:r>
+        <w:rPr>
+          <w:sz w:val="22"/>
+        </w:rPr>
         <w:t xml:space="preserve"> přístupných veřejně i po přihlášení</w:t>
       </w:r>
       <w:r>
@@ -113,7 +122,18 @@
     </w:p>
     <w:p>
       <w:pPr>
+        <w:spacing w:after="40"/>
+      </w:pPr>
+      <w:r>
+        <w:t>Zpracovala: Lenka Dvořáková, GNOSTIKA CONSULTING s.r.o.</w:t>
+      </w:r>
+    </w:p>
+    <w:p>
+      <w:pPr>
         <w:spacing w:after="600"/>
+        <w:rPr>
+          <w:sz w:val="22"/>
+        </w:rPr>
       </w:pPr>
       <w:r>
         <w:rPr>
@@ -121,6 +141,14 @@
         </w:rPr>
         <w:t>Stav dat: 19. září 2026</w:t>
       </w:r>
+    </w:p>
+    <w:p>
+      <w:pPr>
+        <w:spacing w:after="600"/>
+        <w:rPr>
+          <w:sz w:val="22"/>
+        </w:rPr>
+      </w:pPr>
     </w:p>
     <w:tbl>
       <w:tblPr>
@@ -255,6 +283,7 @@
         <w:spacing w:after="40"/>
       </w:pPr>
     </w:p>
+    <w:p/>
     <w:p>
       <w:r>
         <w:br w:type="page"/>
@@ -17758,7 +17787,6 @@
       </w:r>
     </w:p>
     <w:sectPr>
-      <w:footerReference w:type="default" r:id="rId8"/>
       <w:pgSz w:w="11906" w:h="16838"/>
       <w:pgMar w:top="1247" w:right="1247" w:bottom="1134" w:left="1247" w:header="720" w:footer="720" w:gutter="0"/>
       <w:cols w:space="720"/>
@@ -17791,60 +17819,6 @@
     </w:p>
   </w:endnote>
 </w:endnotes>
-</file>
-
-<file path=word/footer1.xml><?xml version="1.0" encoding="utf-8"?>
-<w:ftr xmlns:wpc="http://schemas.microsoft.com/office/word/2010/wordprocessingCanvas" xmlns:cx="http://schemas.microsoft.com/office/drawing/2014/chartex" xmlns:cx1="http://schemas.microsoft.com/office/drawing/2015/9/8/chartex" xmlns:cx2="http://schemas.microsoft.com/office/drawing/2015/10/21/chartex" xmlns:cx3="http://schemas.microsoft.com/office/drawing/2016/5/9/chartex" xmlns:cx4="http://schemas.microsoft.com/office/drawing/2016/5/10/chartex" xmlns:cx5="http://schemas.microsoft.com/office/drawing/2016/5/11/chartex" xmlns:cx6="http://schemas.microsoft.com/office/drawing/2016/5/12/chartex" xmlns:cx7="http://schemas.microsoft.com/office/drawing/2016/5/13/chartex" xmlns:cx8="http://schemas.microsoft.com/office/drawing/2016/5/14/chartex" xmlns:mc="http://schemas.openxmlformats.org/markup-compatibility/2006" xmlns:aink="http://schemas.microsoft.com/office/drawing/2016/ink" xmlns:am3d="http://schemas.microsoft.com/office/drawing/2017/model3d" xmlns:o="urn:schemas-microsoft-com:office:office" xmlns:oel="http://schemas.microsoft.com/office/2019/extlst" xmlns:r="http://schemas.openxmlformats.org/officeDocument/2006/relationships" xmlns:m="http://schemas.openxmlformats.org/officeDocument/2006/math" xmlns:v="urn:schemas-microsoft-com:vml" xmlns:wp14="http://schemas.microsoft.com/office/word/2010/wordprocessingDrawing" xmlns:wp="http://schemas.openxmlformats.org/drawingml/2006/wordprocessingDrawing" xmlns:w10="urn:schemas-microsoft-com:office:word" xmlns:w="http://schemas.openxmlformats.org/wordprocessingml/2006/main" xmlns:w14="http://schemas.microsoft.com/office/word/2010/wordml" xmlns:w15="http://schemas.microsoft.com/office/word/2012/wordml" xmlns:w16cex="http://schemas.microsoft.com/office/word/2018/wordml/cex" xmlns:w16cid="http://schemas.microsoft.com/office/word/2016/wordml/cid" xmlns:w16="http://schemas.microsoft.com/office/word/2018/wordml" xmlns:w16du="http://schemas.microsoft.com/office/word/2023/wordml/word16du" xmlns:w16sdtdh="http://schemas.microsoft.com/office/word/2020/wordml/sdtdatahash" xmlns:w16sdtfl="http://schemas.microsoft.com/office/word/2024/wordml/sdtformatlock" xmlns:w16se="http://schemas.microsoft.com/office/word/2015/wordml/symex" xmlns:wpg="http://schemas.microsoft.com/office/word/2010/wordprocessingGroup" xmlns:wpi="http://schemas.microsoft.com/office/word/2010/wordprocessingInk" xmlns:wne="http://schemas.microsoft.com/office/word/2006/wordml" xmlns:wps="http://schemas.microsoft.com/office/word/2010/wordprocessingShape" mc:Ignorable="w14 w15 w16se w16cid w16 w16cex w16sdtdh w16sdtfl w16du wp14">
-  <w:p>
-    <w:pPr>
-      <w:pStyle w:val="Zpat"/>
-      <w:jc w:val="center"/>
-    </w:pPr>
-    <w:r>
-      <w:rPr>
-        <w:color w:val="595959"/>
-        <w:sz w:val="16"/>
-      </w:rPr>
-      <w:t xml:space="preserve">Stav vnitřních předpisů FEKT VUT – pracovní verze 260919   |   strana </w:t>
-    </w:r>
-    <w:r>
-      <w:rPr>
-        <w:color w:val="595959"/>
-        <w:sz w:val="16"/>
-      </w:rPr>
-      <w:fldChar w:fldCharType="begin"/>
-    </w:r>
-    <w:r>
-      <w:rPr>
-        <w:color w:val="595959"/>
-        <w:sz w:val="16"/>
-      </w:rPr>
-      <w:instrText>PAGE</w:instrText>
-    </w:r>
-    <w:r>
-      <w:rPr>
-        <w:color w:val="595959"/>
-        <w:sz w:val="16"/>
-      </w:rPr>
-      <w:fldChar w:fldCharType="separate"/>
-    </w:r>
-    <w:r>
-      <w:rPr>
-        <w:noProof/>
-        <w:color w:val="595959"/>
-        <w:sz w:val="16"/>
-      </w:rPr>
-      <w:t>1</w:t>
-    </w:r>
-    <w:r>
-      <w:rPr>
-        <w:color w:val="595959"/>
-        <w:sz w:val="16"/>
-      </w:rPr>
-      <w:fldChar w:fldCharType="end"/>
-    </w:r>
-  </w:p>
-</w:ftr>
 </file>
 
 <file path=word/footnotes.xml><?xml version="1.0" encoding="utf-8"?>
@@ -29791,7 +29765,7 @@
 </file>
 
 <file path=customXml/itemProps1.xml><?xml version="1.0" encoding="utf-8"?>
-<ds:datastoreItem xmlns:ds="http://schemas.openxmlformats.org/officeDocument/2006/customXml" ds:itemID="{EF278816-EC6F-A645-907D-7F25AECB1D4A}">
+<ds:datastoreItem xmlns:ds="http://schemas.openxmlformats.org/officeDocument/2006/customXml" ds:itemID="{666F314A-2AFA-449E-80E0-FB3FB48000E3}">
   <ds:schemaRefs>
     <ds:schemaRef ds:uri="http://schemas.openxmlformats.org/officeDocument/2006/bibliography"/>
   </ds:schemaRefs>

</xml_diff>

<commit_message>
Weekly review 260920: projekty, GTD úklid, nová area ai-nastroje, projekt arttinder-consulting, diff Handy Library, priority týdne
Co-Authored-By: Claude Sonnet 5 <noreply@anthropic.com>
</commit_message>
<xml_diff>
--- a/resources/Stav-vnitrnich-predpisu-FEKT-VUT-260919.docx
+++ b/resources/Stav-vnitrnich-predpisu-FEKT-VUT-260919.docx
@@ -93,13 +93,7 @@
         <w:rPr>
           <w:sz w:val="22"/>
         </w:rPr>
-        <w:t xml:space="preserve">dat z </w:t>
-      </w:r>
-      <w:r>
-        <w:rPr>
-          <w:sz w:val="22"/>
-        </w:rPr>
-        <w:t>úřední desky VUT</w:t>
+        <w:t>dat z úřední desky VUT</w:t>
       </w:r>
       <w:r>
         <w:rPr>
@@ -6762,7 +6756,13 @@
         <w:t>Pok</w:t>
       </w:r>
       <w:r>
-        <w:t>ryto“ znamená, že norma s odpovídajícím názvem existuje na dané úrovni; „Otazník“ znamená, že jsem nenalezl aktuální normu nebo je skrytá.</w:t>
+        <w:t xml:space="preserve">ryto“ znamená, že norma s odpovídajícím názvem </w:t>
+      </w:r>
+      <w:r>
+        <w:t xml:space="preserve">na dané úrovni </w:t>
+      </w:r>
+      <w:r>
+        <w:t>existuje.</w:t>
       </w:r>
     </w:p>
     <w:tbl>
@@ -7224,13 +7224,7 @@
               <w:rPr>
                 <w:sz w:val="16"/>
               </w:rPr>
-              <w:t>Pok</w:t>
-            </w:r>
-            <w:r>
-              <w:rPr>
-                <w:sz w:val="16"/>
-              </w:rPr>
-              <w:t>ryto centrálně. Chybí fakultní prováděcí pokyny (kdo, kdy, formuláře).</w:t>
+              <w:t>Pokryto centrálně. Chybí fakultní prováděcí pokyny (kdo, kdy, formuláře).</w:t>
             </w:r>
           </w:p>
         </w:tc>
@@ -7317,13 +7311,7 @@
               <w:rPr>
                 <w:sz w:val="16"/>
               </w:rPr>
-              <w:t>Pok</w:t>
-            </w:r>
-            <w:r>
-              <w:rPr>
-                <w:sz w:val="16"/>
-              </w:rPr>
-              <w:t>ryto. Fakultní směrnice z 2021 by měla být revidována.</w:t>
+              <w:t>Pokryto. Fakultní směrnice z 2021 by měla být revidována.</w:t>
             </w:r>
           </w:p>
         </w:tc>
@@ -7413,13 +7401,7 @@
               <w:rPr>
                 <w:sz w:val="16"/>
               </w:rPr>
-              <w:t>Pok</w:t>
-            </w:r>
-            <w:r>
-              <w:rPr>
-                <w:sz w:val="16"/>
-              </w:rPr>
-              <w:t>ryto centrálně. Otázka pro fakultu: kdo schvaluje jaký limit.</w:t>
+              <w:t>Pokryto centrálně. Otázka pro fakultu: kdo schvaluje jaký limit.</w:t>
             </w:r>
           </w:p>
         </w:tc>
@@ -7506,13 +7488,7 @@
               <w:rPr>
                 <w:sz w:val="16"/>
               </w:rPr>
-              <w:t>Pok</w:t>
-            </w:r>
-            <w:r>
-              <w:rPr>
-                <w:sz w:val="16"/>
-              </w:rPr>
-              <w:t>ryto.</w:t>
+              <w:t>Pokryto.</w:t>
             </w:r>
           </w:p>
         </w:tc>
@@ -7602,13 +7578,7 @@
               <w:rPr>
                 <w:sz w:val="16"/>
               </w:rPr>
-              <w:t>Pok</w:t>
-            </w:r>
-            <w:r>
-              <w:rPr>
-                <w:sz w:val="16"/>
-              </w:rPr>
-              <w:t>ryto. Zvážit veřejnost správní režie (jedno z nejdotazovanějších pravidel).</w:t>
+              <w:t>Pokryto. Zvážit veřejnost správní režie (jedno z nejdotazovanějších pravidel).</w:t>
             </w:r>
           </w:p>
         </w:tc>
@@ -7695,13 +7665,7 @@
               <w:rPr>
                 <w:sz w:val="16"/>
               </w:rPr>
-              <w:t>Pok</w:t>
-            </w:r>
-            <w:r>
-              <w:rPr>
-                <w:sz w:val="16"/>
-              </w:rPr>
-              <w:t>ryto centrálně; fakultní úprava dnů volna/práce na dálku není (MFF, PřF ano).</w:t>
+              <w:t>Pokryto centrálně; fakultní úprava dnů volna/práce na dálku není (MFF, PřF ano).</w:t>
             </w:r>
           </w:p>
         </w:tc>
@@ -7885,13 +7849,7 @@
               <w:rPr>
                 <w:sz w:val="16"/>
               </w:rPr>
-              <w:t>Pok</w:t>
-            </w:r>
-            <w:r>
-              <w:rPr>
-                <w:sz w:val="16"/>
-              </w:rPr>
-              <w:t>ryto centrálně.</w:t>
+              <w:t>Pokryto centrálně.</w:t>
             </w:r>
           </w:p>
         </w:tc>
@@ -7981,13 +7939,7 @@
               <w:rPr>
                 <w:sz w:val="16"/>
               </w:rPr>
-              <w:t>Pok</w:t>
-            </w:r>
-            <w:r>
-              <w:rPr>
-                <w:sz w:val="16"/>
-              </w:rPr>
-              <w:t>ryto.</w:t>
+              <w:t>Pokryto.</w:t>
             </w:r>
           </w:p>
         </w:tc>
@@ -8074,13 +8026,7 @@
               <w:rPr>
                 <w:sz w:val="16"/>
               </w:rPr>
-              <w:t>Pok</w:t>
-            </w:r>
-            <w:r>
-              <w:rPr>
-                <w:sz w:val="16"/>
-              </w:rPr>
-              <w:t>ryto.</w:t>
+              <w:t>Pokryto.</w:t>
             </w:r>
           </w:p>
         </w:tc>
@@ -8170,13 +8116,7 @@
               <w:rPr>
                 <w:sz w:val="16"/>
               </w:rPr>
-              <w:t>Pok</w:t>
-            </w:r>
-            <w:r>
-              <w:rPr>
-                <w:sz w:val="16"/>
-              </w:rPr>
-              <w:t>ryto centrálně; fakultní pravidla (školení, revize) nejsou.</w:t>
+              <w:t>Pokryto centrálně; fakultní pravidla (školení, revize) nejsou.</w:t>
             </w:r>
           </w:p>
         </w:tc>
@@ -8263,13 +8203,7 @@
               <w:rPr>
                 <w:sz w:val="16"/>
               </w:rPr>
-              <w:t>Pok</w:t>
-            </w:r>
-            <w:r>
-              <w:rPr>
-                <w:sz w:val="16"/>
-              </w:rPr>
-              <w:t>ryto.</w:t>
+              <w:t>Pokryto.</w:t>
             </w:r>
           </w:p>
         </w:tc>
@@ -8359,13 +8293,7 @@
               <w:rPr>
                 <w:sz w:val="16"/>
               </w:rPr>
-              <w:t>Pok</w:t>
-            </w:r>
-            <w:r>
-              <w:rPr>
-                <w:sz w:val="16"/>
-              </w:rPr>
-              <w:t>ryto centrálně. Chybí fakultní pravidla webu a e-mailu.</w:t>
+              <w:t>Pokryto centrálně. Chybí fakultní pravidla webu a e-mailu.</w:t>
             </w:r>
           </w:p>
         </w:tc>
@@ -8452,13 +8380,7 @@
               <w:rPr>
                 <w:sz w:val="16"/>
               </w:rPr>
-              <w:t>Pok</w:t>
-            </w:r>
-            <w:r>
-              <w:rPr>
-                <w:sz w:val="16"/>
-              </w:rPr>
-              <w:t>ryto minimálně. Fakulty UK mají pravidla pro média a propagaci.</w:t>
+              <w:t>Pokryto minimálně. Fakulty UK mají pravidla pro média a propagaci.</w:t>
             </w:r>
           </w:p>
         </w:tc>
@@ -8549,13 +8471,7 @@
               <w:rPr>
                 <w:sz w:val="16"/>
               </w:rPr>
-              <w:t>Pok</w:t>
-            </w:r>
-            <w:r>
-              <w:rPr>
-                <w:sz w:val="16"/>
-              </w:rPr>
-              <w:t xml:space="preserve">ryto centrálně. </w:t>
+              <w:t xml:space="preserve">Pokryto centrálně. </w:t>
             </w:r>
             <w:r>
               <w:rPr>
@@ -8655,13 +8571,7 @@
               <w:rPr>
                 <w:sz w:val="16"/>
               </w:rPr>
-              <w:t>Pok</w:t>
-            </w:r>
-            <w:r>
-              <w:rPr>
-                <w:sz w:val="16"/>
-              </w:rPr>
-              <w:t>ryto centrálně. Fakultní minimum: kontaktní místo a pravidlo pro osobní údaje v názvech norem.</w:t>
+              <w:t>Pokryto centrálně. Fakultní minimum: kontaktní místo a pravidlo pro osobní údaje v názvech norem.</w:t>
             </w:r>
           </w:p>
         </w:tc>
@@ -8751,13 +8661,7 @@
               <w:rPr>
                 <w:sz w:val="16"/>
               </w:rPr>
-              <w:t>Pok</w:t>
-            </w:r>
-            <w:r>
-              <w:rPr>
-                <w:sz w:val="16"/>
-              </w:rPr>
-              <w:t>ryto centrálně.</w:t>
+              <w:t>Pokryto centrálně.</w:t>
             </w:r>
           </w:p>
         </w:tc>
@@ -8844,13 +8748,7 @@
               <w:rPr>
                 <w:sz w:val="16"/>
               </w:rPr>
-              <w:t>Pok</w:t>
-            </w:r>
-            <w:r>
-              <w:rPr>
-                <w:sz w:val="16"/>
-              </w:rPr>
-              <w:t>ryto; příručka z 2019 by měla být aktualizována.</w:t>
+              <w:t>Pokryto; příručka z 2019 by měla být aktualizována.</w:t>
             </w:r>
           </w:p>
         </w:tc>
@@ -8940,13 +8838,7 @@
               <w:rPr>
                 <w:sz w:val="16"/>
               </w:rPr>
-              <w:t>Pok</w:t>
-            </w:r>
-            <w:r>
-              <w:rPr>
-                <w:sz w:val="16"/>
-              </w:rPr>
-              <w:t>ryto centrálně.</w:t>
+              <w:t>Pokryto centrálně.</w:t>
             </w:r>
           </w:p>
         </w:tc>
@@ -9033,13 +8925,7 @@
               <w:rPr>
                 <w:sz w:val="16"/>
               </w:rPr>
-              <w:t>Pok</w:t>
-            </w:r>
-            <w:r>
-              <w:rPr>
-                <w:sz w:val="16"/>
-              </w:rPr>
-              <w:t>ryto centrálně; Statut čl. 44 na ni odkazuje.</w:t>
+              <w:t>Pokryto centrálně; Statut čl. 44 na ni odkazuje.</w:t>
             </w:r>
           </w:p>
         </w:tc>
@@ -9129,13 +9015,7 @@
               <w:rPr>
                 <w:sz w:val="16"/>
               </w:rPr>
-              <w:t>Pok</w:t>
-            </w:r>
-            <w:r>
-              <w:rPr>
-                <w:sz w:val="16"/>
-              </w:rPr>
-              <w:t>ryto fakultně.</w:t>
+              <w:t>Pokryto fakultně.</w:t>
             </w:r>
           </w:p>
         </w:tc>
@@ -9287,58 +9167,16 @@
         <w:rPr>
           <w:b/>
         </w:rPr>
-        <w:t>Z</w:t>
-      </w:r>
-      <w:r>
-        <w:rPr>
-          <w:b/>
-        </w:rPr>
-        <w:t>veřejn</w:t>
-      </w:r>
-      <w:r>
-        <w:rPr>
-          <w:b/>
-        </w:rPr>
-        <w:t>ění norem</w:t>
-      </w:r>
-      <w:r>
-        <w:t xml:space="preserve">: v oblastech, kde má norma přímý dopad na studenty a uchazeče, je </w:t>
-      </w:r>
-      <w:r>
-        <w:t>veřejná dostupnost v pořádku</w:t>
-      </w:r>
-      <w:r>
-        <w:t>. V oblastech, které se dotýkají všech zaměstnanců (kompetence, vozidla, provozní řád, správní režie), jsou skryta i pravidla, která by m</w:t>
-      </w:r>
-      <w:r>
-        <w:t xml:space="preserve">ěla být </w:t>
-      </w:r>
-      <w:r>
-        <w:t>zaměstnanc</w:t>
-      </w:r>
-      <w:r>
-        <w:t>ům</w:t>
-      </w:r>
-      <w:r>
-        <w:t>, host</w:t>
-      </w:r>
-      <w:r>
-        <w:t>ům</w:t>
-      </w:r>
-      <w:r>
-        <w:t xml:space="preserve"> </w:t>
-      </w:r>
-      <w:r>
-        <w:t>č</w:t>
-      </w:r>
-      <w:r>
-        <w:t>i kontrolor</w:t>
-      </w:r>
-      <w:r>
-        <w:t>ům známá a dostupná i bez přihlášení</w:t>
-      </w:r>
-      <w:r>
-        <w:t>.</w:t>
+        <w:t>Zveřejnění norem</w:t>
+      </w:r>
+      <w:r>
+        <w:t xml:space="preserve">: v oblastech, kde má norma přímý dopad na studenty a uchazeče, je veřejná dostupnost v pořádku. V oblastech, které se dotýkají všech zaměstnanců (kompetence, vozidla, provozní řád, správní režie), jsou skryta i pravidla, která by </w:t>
+      </w:r>
+      <w:r>
+        <w:t>mohla</w:t>
+      </w:r>
+      <w:r>
+        <w:t xml:space="preserve"> být zaměstnancům, hostům či kontrolorům známá a dostupná i bez přihlášení.</w:t>
       </w:r>
     </w:p>
     <w:p>
@@ -11109,7 +10947,19 @@
               <w:rPr>
                 <w:sz w:val="20"/>
               </w:rPr>
-              <w:t xml:space="preserve"> kompromis: nikoho nenutí zveřejnit vše, ale nikdo nemusí hádat, co existuje.</w:t>
+              <w:t xml:space="preserve"> kompromis: nikoho nenutí zveřejnit vše, ale </w:t>
+            </w:r>
+            <w:r>
+              <w:rPr>
+                <w:sz w:val="20"/>
+              </w:rPr>
+              <w:t>není nutné</w:t>
+            </w:r>
+            <w:r>
+              <w:rPr>
+                <w:sz w:val="20"/>
+              </w:rPr>
+              <w:t xml:space="preserve"> hádat, co existuje.</w:t>
             </w:r>
           </w:p>
           <w:p>
@@ -11758,13 +11608,7 @@
               <w:rPr>
                 <w:sz w:val="17"/>
               </w:rPr>
-              <w:t>V</w:t>
-            </w:r>
-            <w:r>
-              <w:rPr>
-                <w:sz w:val="17"/>
-              </w:rPr>
-              <w:t xml:space="preserve">nitřní norma (směrnice děkana) se třemi třídami: </w:t>
+              <w:t xml:space="preserve">Vnitřní norma (směrnice děkana) se třemi třídami: </w:t>
             </w:r>
             <w:r>
               <w:rPr>
@@ -17774,16 +17618,6 @@
       </w:pPr>
       <w:r>
         <w:t>Zákon č. 111/1998 Sb., o vysokých školách: https://www.zakonyprolidi.cz/cs/1998-111</w:t>
-      </w:r>
-    </w:p>
-    <w:p>
-      <w:pPr>
-        <w:pStyle w:val="Seznamsodrkami"/>
-        <w:spacing w:after="40"/>
-        <w:ind w:left="340"/>
-      </w:pPr>
-      <w:r>
-        <w:t>Související pracovní soubory: resources/fekt-vut-vnitrni-normy-nestudijni.md, resources/fekt-vut-smernice-pokyny-metodicke-listy.md, resources/vnitrni-predpisy-fakult-uk-vs-fekt-vut.md</w:t>
       </w:r>
     </w:p>
     <w:sectPr>

</xml_diff>